<commit_message>
Evening completion: delivery ratios filled, verification log with Friday-final deltas
https://claude.ai/code/session_01NDeVYnid9JhNYXfTo4RGQV
</commit_message>
<xml_diff>
--- a/drafts/2026-08-07/echo_draft.docx
+++ b/drafts/2026-08-07/echo_draft.docx
@@ -547,7 +547,7 @@
               <w:rPr>
                 <w:i w:val="0"/>
               </w:rPr>
-              <w:t>*(evening)*</w:t>
+              <w:t>1.7X</w:t>
             </w:r>
           </w:p>
         </w:tc>
@@ -635,7 +635,7 @@
               <w:rPr>
                 <w:i w:val="0"/>
               </w:rPr>
-              <w:t>*(evening)*</w:t>
+              <w:t>2.1X</w:t>
             </w:r>
           </w:p>
         </w:tc>
@@ -679,7 +679,7 @@
               <w:rPr>
                 <w:i w:val="0"/>
               </w:rPr>
-              <w:t>*(evening)*</w:t>
+              <w:t>1.3X</w:t>
             </w:r>
           </w:p>
         </w:tc>
@@ -723,7 +723,7 @@
               <w:rPr>
                 <w:i w:val="0"/>
               </w:rPr>
-              <w:t>*(evening)*</w:t>
+              <w:t>—</w:t>
             </w:r>
           </w:p>
         </w:tc>
@@ -949,7 +949,7 @@
               <w:rPr>
                 <w:i w:val="0"/>
               </w:rPr>
-              <w:t>*(evening)*</w:t>
+              <w:t>—</w:t>
             </w:r>
           </w:p>
         </w:tc>
@@ -993,7 +993,7 @@
               <w:rPr>
                 <w:i w:val="0"/>
               </w:rPr>
-              <w:t>*(evening)*</w:t>
+              <w:t>1.0X</w:t>
             </w:r>
           </w:p>
         </w:tc>
@@ -1081,7 +1081,7 @@
               <w:rPr>
                 <w:i w:val="0"/>
               </w:rPr>
-              <w:t>*(evening)*</w:t>
+              <w:t>—</w:t>
             </w:r>
           </w:p>
         </w:tc>
@@ -1125,7 +1125,7 @@
               <w:rPr>
                 <w:i w:val="0"/>
               </w:rPr>
-              <w:t>*(evening)*</w:t>
+              <w:t>—</w:t>
             </w:r>
           </w:p>
         </w:tc>

</xml_diff>